<commit_message>
release: prepare submission-ready v1.0.0
</commit_message>
<xml_diff>
--- a/paper-amc/highlights.docx
+++ b/paper-amc/highlights.docx
@@ -19,8 +19,14 @@
       </w:r>
     </w:p>
     <w:p>
+      <w:pPr>
+        <w:jc w:val="left"/>
+      </w:pPr>
       <w:r>
-        <w:t>Trung-Kiet Huynh, Dao Sy Duy Minh, Chi-Nguyen Tran, Nguyen Lam Phu Quy, Pham Phu Hoa</w:t>
+        <w:rPr>
+          <w:sz w:val="19"/>
+        </w:rPr>
+        <w:t>Trung-Kiet Huynh, Dao-Sy Duy-Minh, Chi-Nguyen Tran, Nguyen Lam Phu Quy, Pham Phu Hoa</w:t>
       </w:r>
     </w:p>
     <w:p>
@@ -52,7 +58,7 @@
         <w:pStyle w:val="ListBullet"/>
       </w:pPr>
       <w:r>
-        <w:t>An attribution floor matches reachable depth-cap safety-payoff outcomes</w:t>
+        <w:t>A floor closely traces the depth-cap frontier over its attainable range</w:t>
       </w:r>
     </w:p>
     <w:sectPr>

</xml_diff>